<commit_message>
Chapter 1: explicit $HOME\spa paths for every folder the lessons create
</commit_message>
<xml_diff>
--- a/Volume 1/Chapter 01 - Development Environment/SPA_Vol1_Ch1_Lesson1_10_First_Multi_Language_Project.docx
+++ b/Volume 1/Chapter 01 - Development Environment/SPA_Vol1_Ch1_Lesson1_10_First_Multi_Language_Project.docx
@@ -397,7 +397,7 @@
         <w:keepNext/>
       </w:pPr>
       <w:r>
-        <w:t>New-Item -ItemType Directory -Force $HOME\spa | Out-Null</w:t>
+        <w:t>New-Item -ItemType Directory -Force "$HOME\spa" | Out-Null</w:t>
       </w:r>
     </w:p>
     <w:p>
@@ -406,7 +406,7 @@
         <w:keepNext/>
       </w:pPr>
       <w:r>
-        <w:t>Set-Location $HOME\spa</w:t>
+        <w:t>Set-Location "$HOME\spa"</w:t>
       </w:r>
     </w:p>
     <w:p>
@@ -501,7 +501,7 @@
         <w:keepNext/>
       </w:pPr>
       <w:r>
-        <w:t>mkdir -p ~/spa</w:t>
+        <w:t>mkdir -p "$HOME/spa"</w:t>
       </w:r>
     </w:p>
     <w:p>
@@ -510,7 +510,7 @@
         <w:keepNext/>
       </w:pPr>
       <w:r>
-        <w:t>cd ~/spa</w:t>
+        <w:t>cd "$HOME/spa"</w:t>
       </w:r>
     </w:p>
     <w:p>
@@ -670,7 +670,7 @@
         <w:keepNext/>
       </w:pPr>
       <w:r>
-        <w:t>New-Item -ItemType Directory -Force .\lesson-1.10 | Out-Null</w:t>
+        <w:t>New-Item -ItemType Directory -Force "$HOME\spa\lesson-1.10" | Out-Null</w:t>
       </w:r>
     </w:p>
     <w:p>
@@ -679,7 +679,7 @@
         <w:keepNext/>
       </w:pPr>
       <w:r>
-        <w:t>Set-Location .\lesson-1.10</w:t>
+        <w:t>Set-Location "$HOME\spa\lesson-1.10"</w:t>
       </w:r>
     </w:p>
     <w:p>
@@ -697,7 +697,7 @@
         <w:keepNext/>
       </w:pPr>
       <w:r>
-        <w:t>New-Item -ItemType Directory -Force .\c, .\cpp, .\go\basic | Out-Null</w:t>
+        <w:t>New-Item -ItemType Directory -Force "$HOME\spa\lesson-1.10\c" | Out-Null</w:t>
       </w:r>
     </w:p>
     <w:p>
@@ -706,7 +706,43 @@
         <w:keepNext/>
       </w:pPr>
       <w:r>
-        <w:t>New-Item -ItemType Directory -Force .\python, .\typescript\src | Out-Null</w:t>
+        <w:t>New-Item -ItemType Directory -Force "$HOME\spa\lesson-1.10\cpp" | Out-Null</w:t>
+      </w:r>
+    </w:p>
+    <w:p>
+      <w:pPr>
+        <w:pStyle w:val="CommandBlock"/>
+        <w:keepNext/>
+      </w:pPr>
+      <w:r>
+        <w:t>New-Item -ItemType Directory -Force "$HOME\spa\lesson-1.10\go\basic" | Out-Null</w:t>
+      </w:r>
+    </w:p>
+    <w:p>
+      <w:pPr>
+        <w:pStyle w:val="CommandBlock"/>
+        <w:keepNext/>
+      </w:pPr>
+      <w:r>
+        <w:t>New-Item -ItemType Directory -Force "$HOME\spa\lesson-1.10\python" | Out-Null</w:t>
+      </w:r>
+    </w:p>
+    <w:p>
+      <w:pPr>
+        <w:pStyle w:val="CommandBlock"/>
+        <w:keepNext/>
+      </w:pPr>
+      <w:r>
+        <w:t>New-Item -ItemType Directory -Force "$HOME\spa\lesson-1.10\typescript\src" |</w:t>
+      </w:r>
+    </w:p>
+    <w:p>
+      <w:pPr>
+        <w:pStyle w:val="CommandBlock"/>
+        <w:keepNext/>
+      </w:pPr>
+      <w:r>
+        <w:t xml:space="preserve">    Out-Null</w:t>
       </w:r>
     </w:p>
     <w:p>
@@ -810,7 +846,7 @@
         <w:pStyle w:val="ListBullet"/>
       </w:pPr>
       <w:r>
-        <w:t>New-Item accepts a list of folders separated by commas, and makes every missing folder on the way, so .\go\basic also makes .\go.</w:t>
+        <w:t>Each New-Item line makes a folder and every missing folder on the way, so the line for .\go\basic also makes .\go. Each folder is a full path that starts with $HOME\spa, so the line makes the same folder from any folder you are in. A | at the end of a line carries the command on to the next line.</w:t>
       </w:r>
     </w:p>
     <w:p>
@@ -872,7 +908,7 @@
         <w:keepNext/>
       </w:pPr>
       <w:r>
-        <w:t>mkdir -p ~/spa/lesson-1.10</w:t>
+        <w:t>mkdir -p "$HOME/spa/lesson-1.10"</w:t>
       </w:r>
     </w:p>
     <w:p>
@@ -881,7 +917,7 @@
         <w:keepNext/>
       </w:pPr>
       <w:r>
-        <w:t>cd ~/spa/lesson-1.10</w:t>
+        <w:t>cd "$HOME/spa/lesson-1.10"</w:t>
       </w:r>
     </w:p>
     <w:p>
@@ -899,7 +935,25 @@
         <w:keepNext/>
       </w:pPr>
       <w:r>
-        <w:t>mkdir -p ./c ./cpp ./go/basic ./python ./typescript/src</w:t>
+        <w:t>mkdir -p "$HOME/spa/lesson-1.10/c" "$HOME/spa/lesson-1.10/cpp"</w:t>
+      </w:r>
+    </w:p>
+    <w:p>
+      <w:pPr>
+        <w:pStyle w:val="CommandBlock"/>
+        <w:keepNext/>
+      </w:pPr>
+      <w:r>
+        <w:t>mkdir -p "$HOME/spa/lesson-1.10/go/basic" "$HOME/spa/lesson-1.10/python"</w:t>
+      </w:r>
+    </w:p>
+    <w:p>
+      <w:pPr>
+        <w:pStyle w:val="CommandBlock"/>
+        <w:keepNext/>
+      </w:pPr>
+      <w:r>
+        <w:t>mkdir -p "$HOME/spa/lesson-1.10/typescript/src"</w:t>
       </w:r>
     </w:p>
     <w:p>
@@ -9125,31 +9179,31 @@
       </w:rPr>
     </w:lvl>
   </w:abstractNum>
-  <w:num w:numId="1" w16cid:durableId="238029672">
+  <w:num w:numId="1" w16cid:durableId="1064915823">
     <w:abstractNumId w:val="8"/>
   </w:num>
-  <w:num w:numId="2" w16cid:durableId="1758289839">
+  <w:num w:numId="2" w16cid:durableId="268782441">
     <w:abstractNumId w:val="6"/>
   </w:num>
-  <w:num w:numId="3" w16cid:durableId="1986275759">
+  <w:num w:numId="3" w16cid:durableId="1682468099">
     <w:abstractNumId w:val="5"/>
   </w:num>
-  <w:num w:numId="4" w16cid:durableId="2029141495">
+  <w:num w:numId="4" w16cid:durableId="485710042">
     <w:abstractNumId w:val="4"/>
   </w:num>
-  <w:num w:numId="5" w16cid:durableId="130094248">
+  <w:num w:numId="5" w16cid:durableId="1095979129">
     <w:abstractNumId w:val="7"/>
   </w:num>
-  <w:num w:numId="6" w16cid:durableId="680666025">
+  <w:num w:numId="6" w16cid:durableId="21440755">
     <w:abstractNumId w:val="3"/>
   </w:num>
-  <w:num w:numId="7" w16cid:durableId="1928078990">
+  <w:num w:numId="7" w16cid:durableId="866722290">
     <w:abstractNumId w:val="2"/>
   </w:num>
-  <w:num w:numId="8" w16cid:durableId="545020674">
+  <w:num w:numId="8" w16cid:durableId="11693051">
     <w:abstractNumId w:val="1"/>
   </w:num>
-  <w:num w:numId="9" w16cid:durableId="1928028765">
+  <w:num w:numId="9" w16cid:durableId="715929567">
     <w:abstractNumId w:val="0"/>
   </w:num>
 </w:numbering>

</xml_diff>

<commit_message>
Volume 1, Chapter 1: updated lessons
</commit_message>
<xml_diff>
--- a/Volume 1/Chapter 01 - Development Environment/SPA_Vol1_Ch1_Lesson1_10_First_Multi_Language_Project.docx
+++ b/Volume 1/Chapter 01 - Development Environment/SPA_Vol1_Ch1_Lesson1_10_First_Multi_Language_Project.docx
@@ -854,6 +854,7 @@
         <w:pStyle w:val="ListBullet"/>
       </w:pPr>
       <w:r>
+        <w:lastRenderedPageBreak/>
         <w:t>Each dotnet new line prints The template "Console App" was created successfully. and ends with Restore succeeded. It made a C# project folder with a .csproj file and a Program.cs. BasicSystemReport is the first piece of the report, and SystemReport the whole report.</w:t>
       </w:r>
     </w:p>
@@ -1072,13 +1073,7 @@
         <w:rPr>
           <w:b/>
         </w:rPr>
-        <w:t xml:space="preserve">On the Name line, type the user name $env:USERNAME printed in place of </w:t>
-      </w:r>
-      <w:r>
-        <w:rPr>
-          <w:b/>
-        </w:rPr>
-        <w:t>&lt;&lt;&lt;your $env:USERNAME&gt;&gt;&gt;,</w:t>
+        <w:t>On the Name line, type the user name $env:USERNAME printed in place of &lt;&lt;&lt;your $env:USERNAME&gt;&gt;&gt;,</w:t>
       </w:r>
       <w:r>
         <w:t xml:space="preserve"> keeping the quotes and the \n. Read each comment as you type it.</w:t>
@@ -8990,10 +8985,7 @@
     </w:p>
     <w:p>
       <w:r>
-        <w:t>You built Chapter 1's System Information Utility in C, C++, C#, Go, Python, and TypeScript, one piece at a time: the title and Name lines first, then the whole report, built with each language's strict settings and checked by its output and its exit code. You committed each language on its own, kept every build output out of the history, reviewed a change with git diff, and undid a broken one with git restore. Chapter 1 is complete. The optional Lessons 1.11 to 1.14 set up Assembly, Rust, Erlang, and Solidi</w:t>
-      </w:r>
-      <w:r>
-        <w:t>ty, and Chapter 2 starts the language fundamentals and grows this utility to report facts it finds out for itself. Start every lesson with Set-Location $HOME\spa.</w:t>
+        <w:t>You built Chapter 1's System Information Utility in C, C++, C#, Go, Python, and TypeScript, one piece at a time: the title and Name lines first, then the whole report, built with each language's strict settings and checked by its output and its exit code. You committed each language on its own, kept every build output out of the history, reviewed a change with git diff, and undid a broken one with git restore. Chapter 1 is complete. The optional Lessons 1.11 to 1.14 set up Assembly, Rust, Erlang, and Solidity, and Chapter 2 starts the language fundamentals and grows this utility to report facts it finds out for itself. Start every lesson with Set-Location $HOME\spa.</w:t>
       </w:r>
     </w:p>
     <w:sectPr>

</xml_diff>